<commit_message>
Redesign site, remove classified project name, tighten portfolio content
- New editorial theme: warm ivory/ink palette, bronze accent, film grain, refined motion

- Merge Samsung work into a Carrier Services Platform card; drop the classified project name everywhere

- Rewrite About, work intro, AI tooling card and Aeronology bullets (LIFT Airlines)

- Remove filler: repeated work-auth copy, languages card, CV button, soft-skill rows, profile header

- Trim README; fold certification into one line; rebuild resume and CV
</commit_message>
<xml_diff>
--- a/documents/Lorenzo_Ocampo_CV_2026.docx
+++ b/documents/Lorenzo_Ocampo_CV_2026.docx
@@ -133,7 +133,7 @@
           <w:i w:val="0"/>
           <w:sz w:val="21"/>
         </w:rPr>
-        <w:t>Full stack software engineer with 2+ years building and supporting production systems in Java/Spring Boot, Vue.js and AWS, currently at Samsung R&amp;D and previously on an airline ticketing platform. Builds features across the frontend and backend, handles client and stakeholder requests, and regularly uses AI-assisted automation to speed up support and testing. Also owns quarterly planning and new-hire onboarding, and works as an associate technical PM / product owner across teams. Strong written English; seeking a fully remote, product-focused role.</w:t>
+        <w:t>Full stack software engineer with 2+ years building and supporting production systems in Java/Spring Boot, Vue.js and AWS, currently at Samsung R&amp;D and previously on an airline ticketing platform. Builds features across the frontend and backend, handles client and stakeholder requests, and regularly improves manual workflows with AI-assisted automation. Also owns quarterly planning and new-hire onboarding, and works as an associate technical PM / product owner across teams. Strong written English; seeking a fully remote, product-focused role.</w:t>
       </w:r>
     </w:p>
     <w:p>
@@ -271,7 +271,7 @@
           <w:i w:val="0"/>
           <w:sz w:val="21"/>
         </w:rPr>
-        <w:t>Leads the Samsung SIM Unlock (SSU) task force, building its Vue.js frontend and Java/Spring Boot backend on AWS</w:t>
+        <w:t>Leads the main task force on a carrier services platform, building the frontend for its new pages in Vue.js and a per-device history log in Java/Spring Boot on AWS</w:t>
       </w:r>
     </w:p>
     <w:p>
@@ -319,7 +319,7 @@
           <w:i w:val="0"/>
           <w:sz w:val="21"/>
         </w:rPr>
-        <w:t>Regularly builds AI-assisted scripts that speed up ticket resolution and endpoint testing</w:t>
+        <w:t>Regularly analyzes manual team workflows for slow or repetitive steps and improves them with AI-assisted automation</w:t>
       </w:r>
     </w:p>
     <w:p>
@@ -457,7 +457,7 @@
           <w:i w:val="0"/>
           <w:sz w:val="21"/>
         </w:rPr>
-        <w:t>Built and extended booking and ticketing features on an airline ticketing platform (.NET/C#, React.js, SQL/MySQL, Python, AWS)</w:t>
+        <w:t>Built and extended booking and ticketing features on an airline ticketing platform used by travel agencies (.NET/C#, React.js, SQL/MySQL, Python, AWS)</w:t>
       </w:r>
     </w:p>
     <w:p>
@@ -473,7 +473,7 @@
           <w:i w:val="0"/>
           <w:sz w:val="21"/>
         </w:rPr>
-        <w:t>Integrated South African Airlines into the platform, extending access to international routes</w:t>
+        <w:t>Owned the LIFT Airlines integration end to end, so travel agencies could book LIFT flights through the platform</w:t>
       </w:r>
     </w:p>
     <w:p>
@@ -489,7 +489,7 @@
           <w:i w:val="0"/>
           <w:sz w:val="21"/>
         </w:rPr>
-        <w:t>Investigated production incidents and shipped hotfixes and targeted fixes, reducing downtime and improving system reliability</w:t>
+        <w:t>Investigated production incidents, mostly flight-detail mismatches caused by airline API data, and shipped hotfixes that handle incomplete data so the same errors stopped recurring</w:t>
       </w:r>
     </w:p>
     <w:p>
@@ -505,7 +505,7 @@
           <w:i w:val="0"/>
           <w:sz w:val="21"/>
         </w:rPr>
-        <w:t>Handled client and stakeholder requests alongside feature work</w:t>
+        <w:t>Handled travel-agency client requests alongside feature work</w:t>
       </w:r>
     </w:p>
     <w:p>
@@ -583,7 +583,7 @@
           <w:i/>
           <w:sz w:val="21"/>
         </w:rPr>
-        <w:t xml:space="preserve"> | Python, FastAPI, SQLite, Vue.js, Claude</w:t>
+        <w:t xml:space="preserve"> | Python, FastAPI, SQLite, Vue.js</w:t>
       </w:r>
       <w:r>
         <w:rPr>
@@ -635,7 +635,7 @@
           <w:i/>
           <w:sz w:val="21"/>
         </w:rPr>
-        <w:t xml:space="preserve"> | Node.js, SQLite, REST API, Claude</w:t>
+        <w:t xml:space="preserve"> | Node.js, SQLite, REST API</w:t>
       </w:r>
       <w:r>
         <w:rPr>
@@ -909,7 +909,7 @@
           <w:i w:val="0"/>
           <w:sz w:val="21"/>
         </w:rPr>
-        <w:t>Lambda, SQS, KMS, S3, Athena</w:t>
+        <w:t>EC2, Lambda, SQS, KMS, S3, Athena</w:t>
       </w:r>
     </w:p>
     <w:p>

</xml_diff>

<commit_message>
Merge scheduler into retail site card; rewrite problem, built and scheduler rows
</commit_message>
<xml_diff>
--- a/documents/Lorenzo_Ocampo_CV_2026.docx
+++ b/documents/Lorenzo_Ocampo_CV_2026.docx
@@ -608,59 +608,7 @@
           <w:i w:val="0"/>
           <w:sz w:val="21"/>
         </w:rPr>
-        <w:t>Builds and maintains a local web app for a multi-brand fashion retailer that turns daily ERP exports into sales, inventory and sell-through dashboards and a weekly owners' report, reusing the existing Python ETL cleaning code so its numbers match the Excel reports</w:t>
-      </w:r>
-    </w:p>
-    <w:p>
-      <w:pPr>
-        <w:keepNext/>
-        <w:tabs>
-          <w:tab w:pos="10080" w:val="right"/>
-        </w:tabs>
-        <w:spacing w:before="0" w:after="20" w:line="240" w:lineRule="auto"/>
-      </w:pPr>
-      <w:r>
-        <w:rPr>
-          <w:rFonts w:ascii="Calibri" w:hAnsi="Calibri" w:eastAsia="Calibri"/>
-          <w:b/>
-          <w:i w:val="0"/>
-          <w:sz w:val="21"/>
-        </w:rPr>
-        <w:t>Staff Scheduling Application</w:t>
-      </w:r>
-      <w:r>
-        <w:rPr>
-          <w:rFonts w:ascii="Calibri" w:hAnsi="Calibri" w:eastAsia="Calibri"/>
-          <w:b w:val="0"/>
-          <w:i/>
-          <w:sz w:val="21"/>
-        </w:rPr>
-        <w:t xml:space="preserve"> | Node.js, SQLite, REST API</w:t>
-      </w:r>
-      <w:r>
-        <w:rPr>
-          <w:rFonts w:ascii="Calibri" w:hAnsi="Calibri" w:eastAsia="Calibri"/>
-          <w:b w:val="0"/>
-          <w:i/>
-          <w:sz w:val="21"/>
-        </w:rPr>
-        <w:tab/>
-      </w:r>
-    </w:p>
-    <w:p>
-      <w:pPr>
-        <w:pStyle w:val="ListBullet"/>
-        <w:spacing w:before="0" w:after="30" w:line="240" w:lineRule="auto"/>
-        <w:ind w:left="288" w:hanging="245"/>
-      </w:pPr>
-      <w:r>
-        <w:rPr>
-          <w:rFonts w:ascii="Calibri" w:hAnsi="Calibri" w:eastAsia="Calibri"/>
-          <w:b w:val="0"/>
-          <w:i w:val="0"/>
-          <w:sz w:val="21"/>
-        </w:rPr>
-        <w:t>Built a scheduling app with an auto-fill algorithm, REST API and browser frontend for store shifts and staff assignments</w:t>
+        <w:t>Builds and maintains a local web app for a multi-brand fashion retailer that reshapes its data partner's daily ERP exports into the sales, inventory and sell-through views the merchandising manager needs, plus a weekly owners' report, reusing the existing Python ETL cleaning code so its numbers match the Excel reports; includes a staff scheduler with auto-fill assignments that replaced hand and Excel scheduling</w:t>
       </w:r>
     </w:p>
     <w:p>

</xml_diff>